<commit_message>
updated lecture. removing opened lectures caught in previous commits. work laptop commit
</commit_message>
<xml_diff>
--- a/Workshops/Workshop 3 - LM with continuous predictor/Workshop-3---LM-with-a-continuous-predictor.docx
+++ b/Workshops/Workshop 3 - LM with continuous predictor/Workshop-3---LM-with-a-continuous-predictor.docx
@@ -95,7 +95,7 @@
         <w:t xml:space="preserve"> </w:t>
       </w:r>
       <w:r>
-        <w:t xml:space="preserve">2024-09-17</w:t>
+        <w:t xml:space="preserve">2025-08-26</w:t>
       </w:r>
     </w:p>
     <w:sdt>
@@ -143,83 +143,83 @@
     </w:p>
     <w:p>
       <w:pPr>
+        <w:pStyle w:val="Compact"/>
         <w:numPr>
           <w:ilvl w:val="0"/>
           <w:numId w:val="1001"/>
         </w:numPr>
+      </w:pPr>
+      <w:r>
+        <w:t xml:space="preserve">Formulate a research question.</w:t>
+      </w:r>
+    </w:p>
+    <w:p>
+      <w:pPr>
         <w:pStyle w:val="Compact"/>
-      </w:pPr>
-      <w:r>
-        <w:t xml:space="preserve">Formulate a research question.</w:t>
-      </w:r>
-    </w:p>
-    <w:p>
-      <w:pPr>
         <w:numPr>
           <w:ilvl w:val="0"/>
           <w:numId w:val="1001"/>
         </w:numPr>
+      </w:pPr>
+      <w:r>
+        <w:t xml:space="preserve">Perform exploratory data analysis.</w:t>
+      </w:r>
+    </w:p>
+    <w:p>
+      <w:pPr>
         <w:pStyle w:val="Compact"/>
-      </w:pPr>
-      <w:r>
-        <w:t xml:space="preserve">Perform exploratory data analysis.</w:t>
-      </w:r>
-    </w:p>
-    <w:p>
-      <w:pPr>
         <w:numPr>
           <w:ilvl w:val="0"/>
           <w:numId w:val="1001"/>
         </w:numPr>
+      </w:pPr>
+      <w:r>
+        <w:t xml:space="preserve">Identify any hidden assumptions.</w:t>
+      </w:r>
+    </w:p>
+    <w:p>
+      <w:pPr>
         <w:pStyle w:val="Compact"/>
-      </w:pPr>
-      <w:r>
-        <w:t xml:space="preserve">Identify any hidden assumptions.</w:t>
-      </w:r>
-    </w:p>
-    <w:p>
-      <w:pPr>
         <w:numPr>
           <w:ilvl w:val="0"/>
           <w:numId w:val="1001"/>
         </w:numPr>
+      </w:pPr>
+      <w:r>
+        <w:t xml:space="preserve">Fit an appropriate model [Focus of today].</w:t>
+      </w:r>
+    </w:p>
+    <w:p>
+      <w:pPr>
         <w:pStyle w:val="Compact"/>
-      </w:pPr>
-      <w:r>
-        <w:t xml:space="preserve">Fit an appropriate model [Focus of today].</w:t>
-      </w:r>
-    </w:p>
-    <w:p>
-      <w:pPr>
         <w:numPr>
           <w:ilvl w:val="0"/>
           <w:numId w:val="1001"/>
         </w:numPr>
+      </w:pPr>
+      <w:r>
+        <w:t xml:space="preserve">Diagnose the model and check assumptions.</w:t>
+      </w:r>
+    </w:p>
+    <w:p>
+      <w:pPr>
         <w:pStyle w:val="Compact"/>
-      </w:pPr>
-      <w:r>
-        <w:t xml:space="preserve">Diagnose the model and check assumptions.</w:t>
-      </w:r>
-    </w:p>
-    <w:p>
-      <w:pPr>
         <w:numPr>
           <w:ilvl w:val="0"/>
           <w:numId w:val="1001"/>
         </w:numPr>
+      </w:pPr>
+      <w:r>
+        <w:t xml:space="preserve">Summarise the results.</w:t>
+      </w:r>
+    </w:p>
+    <w:p>
+      <w:pPr>
         <w:pStyle w:val="Compact"/>
-      </w:pPr>
-      <w:r>
-        <w:t xml:space="preserve">Summarise the results.</w:t>
-      </w:r>
-    </w:p>
-    <w:p>
-      <w:pPr>
         <w:numPr>
           <w:ilvl w:val="0"/>
           <w:numId w:val="1001"/>
         </w:numPr>
-        <w:pStyle w:val="Compact"/>
       </w:pPr>
       <w:r>
         <w:t xml:space="preserve">Interpret and provide inferences.</w:t>
@@ -268,47 +268,47 @@
     </w:p>
     <w:p>
       <w:pPr>
+        <w:pStyle w:val="Compact"/>
         <w:numPr>
           <w:ilvl w:val="0"/>
           <w:numId w:val="1002"/>
         </w:numPr>
+      </w:pPr>
+      <w:r>
+        <w:rPr>
+          <w:rStyle w:val="VerbatimChar"/>
+        </w:rPr>
+        <w:t xml:space="preserve">sex</w:t>
+      </w:r>
+      <w:r>
+        <w:t xml:space="preserve">: The sex of the boto dolphin.</w:t>
+      </w:r>
+    </w:p>
+    <w:p>
+      <w:pPr>
         <w:pStyle w:val="Compact"/>
-      </w:pPr>
-      <w:r>
-        <w:rPr>
-          <w:rStyle w:val="VerbatimChar"/>
-        </w:rPr>
-        <w:t xml:space="preserve">sex</w:t>
-      </w:r>
-      <w:r>
-        <w:t xml:space="preserve">: The sex of the boto dolphin.</w:t>
-      </w:r>
-    </w:p>
-    <w:p>
-      <w:pPr>
         <w:numPr>
           <w:ilvl w:val="0"/>
           <w:numId w:val="1002"/>
         </w:numPr>
+      </w:pPr>
+      <w:r>
+        <w:rPr>
+          <w:rStyle w:val="VerbatimChar"/>
+        </w:rPr>
+        <w:t xml:space="preserve">drought</w:t>
+      </w:r>
+      <w:r>
+        <w:t xml:space="preserve">: The number of years out of the past 20 where drought was observed in the region where the dolphin was recorded.</w:t>
+      </w:r>
+    </w:p>
+    <w:p>
+      <w:pPr>
         <w:pStyle w:val="Compact"/>
-      </w:pPr>
-      <w:r>
-        <w:rPr>
-          <w:rStyle w:val="VerbatimChar"/>
-        </w:rPr>
-        <w:t xml:space="preserve">drought</w:t>
-      </w:r>
-      <w:r>
-        <w:t xml:space="preserve">: The number of years out of the past 20 where drought was observed in the region where the dolphin was recorded.</w:t>
-      </w:r>
-    </w:p>
-    <w:p>
-      <w:pPr>
         <w:numPr>
           <w:ilvl w:val="0"/>
           <w:numId w:val="1002"/>
         </w:numPr>
-        <w:pStyle w:val="Compact"/>
       </w:pPr>
       <w:r>
         <w:rPr>
@@ -737,8 +737,8 @@
       </w:r>
       <w:r>
         <w:rPr>
+          <w:i/>
           <w:iCs/>
-          <w:i/>
         </w:rPr>
         <w:t xml:space="preserve">only</w:t>
       </w:r>
@@ -1121,7 +1121,7 @@
         <w:t xml:space="preserve"> </w:t>
       </w:r>
       <w:r>
-        <w:t xml:space="preserve">distribution a reasonably safe choice here. However, we should still check the model’s predictions later to ensure it isn’t producing values that are physically implausible. If we the model was predicting the impossible, then we’d switch to another distribution using a</w:t>
+        <w:t xml:space="preserve">distribution a reasonably safe choice here. However, we should still check the model’s predictions later to ensure it isn’t producing values that are physically implausible. If the model predicts the impossible, then we’d switch to another distribution using a</w:t>
       </w:r>
       <w:r>
         <w:t xml:space="preserve"> </w:t>
@@ -1166,8 +1166,8 @@
       </w:pPr>
       <w:r>
         <w:rPr>
+          <w:b/>
           <w:bCs/>
-          <w:b/>
         </w:rPr>
         <w:t xml:space="preserve">Note</w:t>
       </w:r>
@@ -1480,8 +1480,8 @@
       </w:r>
       <w:r>
         <w:rPr>
+          <w:i/>
           <w:iCs/>
-          <w:i/>
         </w:rPr>
         <w:t xml:space="preserve">after</w:t>
       </w:r>
@@ -1701,11 +1701,11 @@
     </w:p>
     <w:p>
       <w:pPr>
+        <w:pStyle w:val="Compact"/>
         <w:numPr>
           <w:ilvl w:val="0"/>
           <w:numId w:val="1005"/>
         </w:numPr>
-        <w:pStyle w:val="Compact"/>
       </w:pPr>
       <m:oMath>
         <m:r>
@@ -1830,11 +1830,11 @@
     </w:p>
     <w:p>
       <w:pPr>
+        <w:pStyle w:val="Compact"/>
         <w:numPr>
           <w:ilvl w:val="0"/>
           <w:numId w:val="1005"/>
         </w:numPr>
-        <w:pStyle w:val="Compact"/>
       </w:pPr>
       <m:oMath>
         <m:sSub>
@@ -1900,11 +1900,11 @@
     </w:p>
     <w:p>
       <w:pPr>
+        <w:pStyle w:val="Compact"/>
         <w:numPr>
           <w:ilvl w:val="1"/>
           <w:numId w:val="1006"/>
         </w:numPr>
-        <w:pStyle w:val="Compact"/>
       </w:pPr>
       <m:oMath>
         <m:sSub>
@@ -1926,11 +1926,11 @@
     </w:p>
     <w:p>
       <w:pPr>
+        <w:pStyle w:val="Compact"/>
         <w:numPr>
           <w:ilvl w:val="1"/>
           <w:numId w:val="1006"/>
         </w:numPr>
-        <w:pStyle w:val="Compact"/>
       </w:pPr>
       <m:oMath>
         <m:sSub>
@@ -2088,76 +2088,76 @@
     </w:p>
     <w:p>
       <w:pPr>
+        <w:pStyle w:val="Compact"/>
         <w:numPr>
           <w:ilvl w:val="0"/>
           <w:numId w:val="1007"/>
         </w:numPr>
+      </w:pPr>
+      <w:r>
+        <w:rPr>
+          <w:rStyle w:val="VerbatimChar"/>
+        </w:rPr>
+        <w:t xml:space="preserve">lm()</w:t>
+      </w:r>
+      <w:r>
+        <w:t xml:space="preserve"> </w:t>
+      </w:r>
+      <w:r>
+        <w:t xml:space="preserve">tells</w:t>
+      </w:r>
+      <w:r>
+        <w:t xml:space="preserve"> </w:t>
+      </w:r>
+      <w:r>
+        <w:rPr>
+          <w:rStyle w:val="VerbatimChar"/>
+        </w:rPr>
+        <w:t xml:space="preserve">R</w:t>
+      </w:r>
+      <w:r>
+        <w:t xml:space="preserve"> </w:t>
+      </w:r>
+      <w:r>
+        <w:t xml:space="preserve">that we are fitting a linear model, which, by default, means that we assume the response variable follows a</w:t>
+      </w:r>
+      <w:r>
+        <w:t xml:space="preserve"> </w:t>
+      </w:r>
+      <m:oMath>
+        <m:r>
+          <m:t>N</m:t>
+        </m:r>
+        <m:r>
+          <m:t>o</m:t>
+        </m:r>
+        <m:r>
+          <m:t>r</m:t>
+        </m:r>
+        <m:r>
+          <m:t>m</m:t>
+        </m:r>
+        <m:r>
+          <m:t>a</m:t>
+        </m:r>
+        <m:r>
+          <m:t>l</m:t>
+        </m:r>
+      </m:oMath>
+      <w:r>
+        <w:t xml:space="preserve"> </w:t>
+      </w:r>
+      <w:r>
+        <w:t xml:space="preserve">distribution.</w:t>
+      </w:r>
+    </w:p>
+    <w:p>
+      <w:pPr>
         <w:pStyle w:val="Compact"/>
-      </w:pPr>
-      <w:r>
-        <w:rPr>
-          <w:rStyle w:val="VerbatimChar"/>
-        </w:rPr>
-        <w:t xml:space="preserve">lm()</w:t>
-      </w:r>
-      <w:r>
-        <w:t xml:space="preserve"> </w:t>
-      </w:r>
-      <w:r>
-        <w:t xml:space="preserve">tells</w:t>
-      </w:r>
-      <w:r>
-        <w:t xml:space="preserve"> </w:t>
-      </w:r>
-      <w:r>
-        <w:rPr>
-          <w:rStyle w:val="VerbatimChar"/>
-        </w:rPr>
-        <w:t xml:space="preserve">R</w:t>
-      </w:r>
-      <w:r>
-        <w:t xml:space="preserve"> </w:t>
-      </w:r>
-      <w:r>
-        <w:t xml:space="preserve">that we are fitting a linear model, which, by default, means that we assume the response variable follows a</w:t>
-      </w:r>
-      <w:r>
-        <w:t xml:space="preserve"> </w:t>
-      </w:r>
-      <m:oMath>
-        <m:r>
-          <m:t>N</m:t>
-        </m:r>
-        <m:r>
-          <m:t>o</m:t>
-        </m:r>
-        <m:r>
-          <m:t>r</m:t>
-        </m:r>
-        <m:r>
-          <m:t>m</m:t>
-        </m:r>
-        <m:r>
-          <m:t>a</m:t>
-        </m:r>
-        <m:r>
-          <m:t>l</m:t>
-        </m:r>
-      </m:oMath>
-      <w:r>
-        <w:t xml:space="preserve"> </w:t>
-      </w:r>
-      <w:r>
-        <w:t xml:space="preserve">distribution.</w:t>
-      </w:r>
-    </w:p>
-    <w:p>
-      <w:pPr>
         <w:numPr>
           <w:ilvl w:val="0"/>
           <w:numId w:val="1007"/>
         </w:numPr>
-        <w:pStyle w:val="Compact"/>
       </w:pPr>
       <w:r>
         <w:t xml:space="preserve">The formula</w:t>
@@ -3283,11 +3283,11 @@
     </w:p>
     <w:p>
       <w:pPr>
+        <w:pStyle w:val="Compact"/>
         <w:numPr>
           <w:ilvl w:val="0"/>
           <w:numId w:val="1008"/>
         </w:numPr>
-        <w:pStyle w:val="Compact"/>
       </w:pPr>
       <w:r>
         <w:t xml:space="preserve">Replace the blank areas of the equation with the values that have now been estimated by the model.</w:t>
@@ -3412,7 +3412,7 @@
           <m:e>
             <m:phant>
               <m:phantPr>
-                <m:show m:val="0"/>
+                <m:show m:val="off"/>
               </m:phantPr>
               <m:e>
                 <m:sSub>
@@ -3444,7 +3444,7 @@
           <m:e>
             <m:phant>
               <m:phantPr>
-                <m:show m:val="0"/>
+                <m:show m:val="off"/>
               </m:phantPr>
               <m:e>
                 <m:sSub>
@@ -3530,8 +3530,8 @@
       </w:r>
       <w:r>
         <w:rPr>
+          <w:i/>
           <w:iCs/>
-          <w:i/>
         </w:rPr>
         <w:t xml:space="preserve">zero</w:t>
       </w:r>
@@ -3571,8 +3571,8 @@
       </w:r>
       <w:r>
         <w:rPr>
+          <w:i/>
           <w:iCs/>
-          <w:i/>
         </w:rPr>
         <w:t xml:space="preserve">eight</w:t>
       </w:r>
@@ -3718,8 +3718,8 @@
       </w:r>
       <w:r>
         <w:rPr>
+          <w:i/>
           <w:iCs/>
-          <w:i/>
         </w:rPr>
         <w:t xml:space="preserve">shrug</w:t>
       </w:r>
@@ -3854,17 +3854,6 @@
           <w:rStyle w:val="NormalTok"/>
         </w:rPr>
         <w:t xml:space="preserve">(ggeffects)</w:t>
-      </w:r>
-    </w:p>
-    <w:p>
-      <w:pPr>
-        <w:pStyle w:val="SourceCode"/>
-      </w:pPr>
-      <w:r>
-        <w:rPr>
-          <w:rStyle w:val="VerbatimChar"/>
-        </w:rPr>
-        <w:t xml:space="preserve">## Warning: package 'ggeffects' was built under R version 4.3.3</w:t>
       </w:r>
     </w:p>
     <w:p>
@@ -4050,16 +4039,225 @@
       </w:r>
       <w:r>
         <w:rPr>
+          <w:i/>
           <w:iCs/>
+        </w:rPr>
+        <w:t xml:space="preserve">fake</w:t>
+      </w:r>
+      <w:r>
+        <w:t xml:space="preserve"> </w:t>
+      </w:r>
+      <w:r>
+        <w:t xml:space="preserve">dataset. This dataset is going to contain, initially, just one variable;</w:t>
+      </w:r>
+      <w:r>
+        <w:t xml:space="preserve"> </w:t>
+      </w:r>
+      <w:r>
+        <w:rPr>
+          <w:rStyle w:val="VerbatimChar"/>
+        </w:rPr>
+        <w:t xml:space="preserve">drought</w:t>
+      </w:r>
+      <w:r>
+        <w:t xml:space="preserve">, and we’re going to keep it as simple as we can. We just want drought values of 0, 1, 2, 3, 4, 5, 6, 7 and 8. We can create this kind of data super easily in</w:t>
+      </w:r>
+      <w:r>
+        <w:t xml:space="preserve"> </w:t>
+      </w:r>
+      <w:r>
+        <w:rPr>
+          <w:rStyle w:val="VerbatimChar"/>
+        </w:rPr>
+        <w:t xml:space="preserve">R</w:t>
+      </w:r>
+      <w:r>
+        <w:t xml:space="preserve"> </w:t>
+      </w:r>
+      <w:r>
+        <w:t xml:space="preserve">using</w:t>
+      </w:r>
+      <w:r>
+        <w:t xml:space="preserve"> </w:t>
+      </w:r>
+      <w:r>
+        <w:rPr>
+          <w:rStyle w:val="VerbatimChar"/>
+        </w:rPr>
+        <w:t xml:space="preserve">0:8</w:t>
+      </w:r>
+      <w:r>
+        <w:t xml:space="preserve">. Try entering</w:t>
+      </w:r>
+      <w:r>
+        <w:t xml:space="preserve"> </w:t>
+      </w:r>
+      <w:r>
+        <w:rPr>
+          <w:rStyle w:val="VerbatimChar"/>
+        </w:rPr>
+        <w:t xml:space="preserve">0:8</w:t>
+      </w:r>
+      <w:r>
+        <w:t xml:space="preserve"> </w:t>
+      </w:r>
+      <w:r>
+        <w:t xml:space="preserve">in the console to see what it does, if you’re unsure. To create the</w:t>
+      </w:r>
+      <w:r>
+        <w:t xml:space="preserve"> </w:t>
+      </w:r>
+      <w:r>
+        <w:rPr>
+          <w:rStyle w:val="VerbatimChar"/>
+        </w:rPr>
+        <w:t xml:space="preserve">fake</w:t>
+      </w:r>
+      <w:r>
+        <w:t xml:space="preserve"> </w:t>
+      </w:r>
+      <w:r>
+        <w:t xml:space="preserve">dataset we use the</w:t>
+      </w:r>
+      <w:r>
+        <w:t xml:space="preserve"> </w:t>
+      </w:r>
+      <w:r>
+        <w:rPr>
+          <w:rStyle w:val="VerbatimChar"/>
+        </w:rPr>
+        <w:t xml:space="preserve">data.frame()</w:t>
+      </w:r>
+      <w:r>
+        <w:t xml:space="preserve"> </w:t>
+      </w:r>
+      <w:r>
+        <w:t xml:space="preserve">function. Bringing this all together, we get:</w:t>
+      </w:r>
+    </w:p>
+    <w:p>
+      <w:pPr>
+        <w:pStyle w:val="SourceCode"/>
+      </w:pPr>
+      <w:r>
+        <w:rPr>
+          <w:rStyle w:val="NormalTok"/>
+        </w:rPr>
+        <w:t xml:space="preserve">fake </w:t>
+      </w:r>
+      <w:r>
+        <w:rPr>
+          <w:rStyle w:val="OtherTok"/>
+        </w:rPr>
+        <w:t xml:space="preserve">&lt;-</w:t>
+      </w:r>
+      <w:r>
+        <w:rPr>
+          <w:rStyle w:val="NormalTok"/>
+        </w:rPr>
+        <w:t xml:space="preserve"> </w:t>
+      </w:r>
+      <w:r>
+        <w:rPr>
+          <w:rStyle w:val="FunctionTok"/>
+        </w:rPr>
+        <w:t xml:space="preserve">data.frame</w:t>
+      </w:r>
+      <w:r>
+        <w:rPr>
+          <w:rStyle w:val="NormalTok"/>
+        </w:rPr>
+        <w:t xml:space="preserve">(</w:t>
+      </w:r>
+      <w:r>
+        <w:br/>
+      </w:r>
+      <w:r>
+        <w:rPr>
+          <w:rStyle w:val="NormalTok"/>
+        </w:rPr>
+        <w:t xml:space="preserve">  </w:t>
+      </w:r>
+      <w:r>
+        <w:rPr>
+          <w:rStyle w:val="AttributeTok"/>
+        </w:rPr>
+        <w:t xml:space="preserve">drought =</w:t>
+      </w:r>
+      <w:r>
+        <w:rPr>
+          <w:rStyle w:val="NormalTok"/>
+        </w:rPr>
+        <w:t xml:space="preserve"> </w:t>
+      </w:r>
+      <w:r>
+        <w:rPr>
+          <w:rStyle w:val="DecValTok"/>
+        </w:rPr>
+        <w:t xml:space="preserve">0</w:t>
+      </w:r>
+      <w:r>
+        <w:rPr>
+          <w:rStyle w:val="SpecialCharTok"/>
+        </w:rPr>
+        <w:t xml:space="preserve">:</w:t>
+      </w:r>
+      <w:r>
+        <w:rPr>
+          <w:rStyle w:val="DecValTok"/>
+        </w:rPr>
+        <w:t xml:space="preserve">8</w:t>
+      </w:r>
+      <w:r>
+        <w:br/>
+      </w:r>
+      <w:r>
+        <w:rPr>
+          <w:rStyle w:val="NormalTok"/>
+        </w:rPr>
+        <w:t xml:space="preserve">)</w:t>
+      </w:r>
+    </w:p>
+    <w:p>
+      <w:pPr>
+        <w:pStyle w:val="FirstParagraph"/>
+      </w:pPr>
+      <w:r>
+        <w:t xml:space="preserve">In Question Set Three, you specified values of drought and used your equation to predict boto length by hand. What we’re going to do next is</w:t>
+      </w:r>
+      <w:r>
+        <w:t xml:space="preserve"> </w:t>
+      </w:r>
+      <w:r>
+        <w:rPr>
           <w:i/>
-        </w:rPr>
-        <w:t xml:space="preserve">fake</w:t>
-      </w:r>
-      <w:r>
-        <w:t xml:space="preserve"> </w:t>
-      </w:r>
-      <w:r>
-        <w:t xml:space="preserve">dataset. This dataset is going to contain, initially, just one variable;</w:t>
+          <w:iCs/>
+        </w:rPr>
+        <w:t xml:space="preserve">exactly</w:t>
+      </w:r>
+      <w:r>
+        <w:t xml:space="preserve"> </w:t>
+      </w:r>
+      <w:r>
+        <w:t xml:space="preserve">the same, we’re just going to be</w:t>
+      </w:r>
+      <w:r>
+        <w:t xml:space="preserve"> </w:t>
+      </w:r>
+      <w:r>
+        <w:t xml:space="preserve">“</w:t>
+      </w:r>
+      <w:r>
+        <w:t xml:space="preserve">lazy</w:t>
+      </w:r>
+      <w:r>
+        <w:t xml:space="preserve">”</w:t>
+      </w:r>
+      <w:r>
+        <w:t xml:space="preserve"> </w:t>
+      </w:r>
+      <w:r>
+        <w:t xml:space="preserve">and have</w:t>
       </w:r>
       <w:r>
         <w:t xml:space="preserve"> </w:t>
@@ -4068,10 +4266,13 @@
         <w:rPr>
           <w:rStyle w:val="VerbatimChar"/>
         </w:rPr>
-        <w:t xml:space="preserve">drought</w:t>
-      </w:r>
-      <w:r>
-        <w:t xml:space="preserve">, and we’re going to keep it as simple as we can. We just want drought values of 0, 1, 2, 3, 4, 5, 6, 7 and 8. We can create this kind of data super easily in</w:t>
+        <w:t xml:space="preserve">R</w:t>
+      </w:r>
+      <w:r>
+        <w:t xml:space="preserve"> </w:t>
+      </w:r>
+      <w:r>
+        <w:t xml:space="preserve">do it for us using the</w:t>
       </w:r>
       <w:r>
         <w:t xml:space="preserve"> </w:t>
@@ -4080,233 +4281,21 @@
         <w:rPr>
           <w:rStyle w:val="VerbatimChar"/>
         </w:rPr>
-        <w:t xml:space="preserve">R</w:t>
-      </w:r>
-      <w:r>
-        <w:t xml:space="preserve"> </w:t>
-      </w:r>
-      <w:r>
-        <w:t xml:space="preserve">using</w:t>
-      </w:r>
-      <w:r>
-        <w:t xml:space="preserve"> </w:t>
-      </w:r>
-      <w:r>
-        <w:rPr>
-          <w:rStyle w:val="VerbatimChar"/>
-        </w:rPr>
-        <w:t xml:space="preserve">0:8</w:t>
-      </w:r>
-      <w:r>
-        <w:t xml:space="preserve">. Try entering</w:t>
-      </w:r>
-      <w:r>
-        <w:t xml:space="preserve"> </w:t>
-      </w:r>
-      <w:r>
-        <w:rPr>
-          <w:rStyle w:val="VerbatimChar"/>
-        </w:rPr>
-        <w:t xml:space="preserve">0:8</w:t>
-      </w:r>
-      <w:r>
-        <w:t xml:space="preserve"> </w:t>
-      </w:r>
-      <w:r>
-        <w:t xml:space="preserve">in the console to see what it does, if you’re unsure. To create the</w:t>
-      </w:r>
-      <w:r>
-        <w:t xml:space="preserve"> </w:t>
-      </w:r>
-      <w:r>
-        <w:rPr>
-          <w:rStyle w:val="VerbatimChar"/>
-        </w:rPr>
-        <w:t xml:space="preserve">fake</w:t>
-      </w:r>
-      <w:r>
-        <w:t xml:space="preserve"> </w:t>
-      </w:r>
-      <w:r>
-        <w:t xml:space="preserve">dataset we use the</w:t>
-      </w:r>
-      <w:r>
-        <w:t xml:space="preserve"> </w:t>
-      </w:r>
-      <w:r>
-        <w:rPr>
-          <w:rStyle w:val="VerbatimChar"/>
-        </w:rPr>
-        <w:t xml:space="preserve">data.frame()</w:t>
-      </w:r>
-      <w:r>
-        <w:t xml:space="preserve"> </w:t>
-      </w:r>
-      <w:r>
-        <w:t xml:space="preserve">function. Bringing this all together, we get:</w:t>
-      </w:r>
-    </w:p>
-    <w:p>
-      <w:pPr>
-        <w:pStyle w:val="SourceCode"/>
-      </w:pPr>
-      <w:r>
-        <w:rPr>
-          <w:rStyle w:val="NormalTok"/>
-        </w:rPr>
-        <w:t xml:space="preserve">fake </w:t>
-      </w:r>
-      <w:r>
-        <w:rPr>
-          <w:rStyle w:val="OtherTok"/>
-        </w:rPr>
-        <w:t xml:space="preserve">&lt;-</w:t>
-      </w:r>
-      <w:r>
-        <w:rPr>
-          <w:rStyle w:val="NormalTok"/>
-        </w:rPr>
-        <w:t xml:space="preserve"> </w:t>
-      </w:r>
-      <w:r>
-        <w:rPr>
-          <w:rStyle w:val="FunctionTok"/>
-        </w:rPr>
-        <w:t xml:space="preserve">data.frame</w:t>
-      </w:r>
-      <w:r>
-        <w:rPr>
-          <w:rStyle w:val="NormalTok"/>
-        </w:rPr>
-        <w:t xml:space="preserve">(</w:t>
-      </w:r>
-      <w:r>
-        <w:br/>
-      </w:r>
-      <w:r>
-        <w:rPr>
-          <w:rStyle w:val="NormalTok"/>
-        </w:rPr>
-        <w:t xml:space="preserve">  </w:t>
-      </w:r>
-      <w:r>
-        <w:rPr>
-          <w:rStyle w:val="AttributeTok"/>
-        </w:rPr>
-        <w:t xml:space="preserve">drought =</w:t>
-      </w:r>
-      <w:r>
-        <w:rPr>
-          <w:rStyle w:val="NormalTok"/>
-        </w:rPr>
-        <w:t xml:space="preserve"> </w:t>
-      </w:r>
-      <w:r>
-        <w:rPr>
-          <w:rStyle w:val="DecValTok"/>
-        </w:rPr>
-        <w:t xml:space="preserve">0</w:t>
-      </w:r>
-      <w:r>
-        <w:rPr>
-          <w:rStyle w:val="SpecialCharTok"/>
-        </w:rPr>
-        <w:t xml:space="preserve">:</w:t>
-      </w:r>
-      <w:r>
-        <w:rPr>
-          <w:rStyle w:val="DecValTok"/>
-        </w:rPr>
-        <w:t xml:space="preserve">8</w:t>
-      </w:r>
-      <w:r>
-        <w:br/>
-      </w:r>
-      <w:r>
-        <w:rPr>
-          <w:rStyle w:val="NormalTok"/>
-        </w:rPr>
-        <w:t xml:space="preserve">)</w:t>
-      </w:r>
-    </w:p>
-    <w:p>
-      <w:pPr>
-        <w:pStyle w:val="FirstParagraph"/>
-      </w:pPr>
-      <w:r>
-        <w:t xml:space="preserve">In Question Set Three, you specified values of drought and used your equation to predict boto length by hand. What we’re going to do next is</w:t>
-      </w:r>
-      <w:r>
-        <w:t xml:space="preserve"> </w:t>
-      </w:r>
-      <w:r>
-        <w:rPr>
+        <w:t xml:space="preserve">predict()</w:t>
+      </w:r>
+      <w:r>
+        <w:t xml:space="preserve"> </w:t>
+      </w:r>
+      <w:r>
+        <w:t xml:space="preserve">function. To be clear, it’s doing</w:t>
+      </w:r>
+      <w:r>
+        <w:t xml:space="preserve"> </w:t>
+      </w:r>
+      <w:r>
+        <w:rPr>
+          <w:i/>
           <w:iCs/>
-          <w:i/>
-        </w:rPr>
-        <w:t xml:space="preserve">exactly</w:t>
-      </w:r>
-      <w:r>
-        <w:t xml:space="preserve"> </w:t>
-      </w:r>
-      <w:r>
-        <w:t xml:space="preserve">the same, we’re just going to be</w:t>
-      </w:r>
-      <w:r>
-        <w:t xml:space="preserve"> </w:t>
-      </w:r>
-      <w:r>
-        <w:t xml:space="preserve">“</w:t>
-      </w:r>
-      <w:r>
-        <w:t xml:space="preserve">lazy</w:t>
-      </w:r>
-      <w:r>
-        <w:t xml:space="preserve">”</w:t>
-      </w:r>
-      <w:r>
-        <w:t xml:space="preserve"> </w:t>
-      </w:r>
-      <w:r>
-        <w:t xml:space="preserve">and have</w:t>
-      </w:r>
-      <w:r>
-        <w:t xml:space="preserve"> </w:t>
-      </w:r>
-      <w:r>
-        <w:rPr>
-          <w:rStyle w:val="VerbatimChar"/>
-        </w:rPr>
-        <w:t xml:space="preserve">R</w:t>
-      </w:r>
-      <w:r>
-        <w:t xml:space="preserve"> </w:t>
-      </w:r>
-      <w:r>
-        <w:t xml:space="preserve">do it for us using the</w:t>
-      </w:r>
-      <w:r>
-        <w:t xml:space="preserve"> </w:t>
-      </w:r>
-      <w:r>
-        <w:rPr>
-          <w:rStyle w:val="VerbatimChar"/>
-        </w:rPr>
-        <w:t xml:space="preserve">predict()</w:t>
-      </w:r>
-      <w:r>
-        <w:t xml:space="preserve"> </w:t>
-      </w:r>
-      <w:r>
-        <w:t xml:space="preserve">function. To be clear, it’s doing</w:t>
-      </w:r>
-      <w:r>
-        <w:t xml:space="preserve"> </w:t>
-      </w:r>
-      <w:r>
-        <w:rPr>
-          <w:iCs/>
-          <w:i/>
         </w:rPr>
         <w:t xml:space="preserve">exactly</w:t>
       </w:r>
@@ -5819,12 +5808,12 @@
         <w:t xml:space="preserve"> </w:t>
       </w:r>
       <w:r>
-        <w:t xml:space="preserve">dataset on MyAberdeen. This data comes from a lab experiment from researchers who were interested in understanding how temperature impacts fecundity in burying beetles beetles (</w:t>
-      </w:r>
-      <w:r>
-        <w:rPr>
+        <w:t xml:space="preserve">dataset on MyAberdeen. This data comes from a lab experiment from researchers who were interested in understanding how temperature impacts fecundity in burying beetles (</w:t>
+      </w:r>
+      <w:r>
+        <w:rPr>
+          <w:i/>
           <w:iCs/>
-          <w:i/>
         </w:rPr>
         <w:t xml:space="preserve">Nicrophorus vespilloides</w:t>
       </w:r>
@@ -5842,32 +5831,32 @@
     </w:p>
     <w:p>
       <w:pPr>
+        <w:pStyle w:val="Compact"/>
         <w:numPr>
           <w:ilvl w:val="0"/>
           <w:numId w:val="1011"/>
         </w:numPr>
+      </w:pPr>
+      <w:r>
+        <w:rPr>
+          <w:rStyle w:val="VerbatimChar"/>
+        </w:rPr>
+        <w:t xml:space="preserve">offspring</w:t>
+      </w:r>
+      <w:r>
+        <w:t xml:space="preserve"> </w:t>
+      </w:r>
+      <w:r>
+        <w:t xml:space="preserve">- the number of offspring produced by the beetles</w:t>
+      </w:r>
+    </w:p>
+    <w:p>
+      <w:pPr>
         <w:pStyle w:val="Compact"/>
-      </w:pPr>
-      <w:r>
-        <w:rPr>
-          <w:rStyle w:val="VerbatimChar"/>
-        </w:rPr>
-        <w:t xml:space="preserve">offspring</w:t>
-      </w:r>
-      <w:r>
-        <w:t xml:space="preserve"> </w:t>
-      </w:r>
-      <w:r>
-        <w:t xml:space="preserve">- the number of offspring produced by the beetles</w:t>
-      </w:r>
-    </w:p>
-    <w:p>
-      <w:pPr>
         <w:numPr>
           <w:ilvl w:val="0"/>
           <w:numId w:val="1011"/>
         </w:numPr>
-        <w:pStyle w:val="Compact"/>
       </w:pPr>
       <w:r>
         <w:rPr>
@@ -5920,8 +5909,8 @@
       <w:tblPr>
         <w:tblStyle w:val="Table"/>
         <w:tblW w:type="pct" w:w="5000"/>
+        <w:tblLayout w:type="fixed"/>
         <w:tblLook w:firstRow="1" w:lastRow="0" w:firstColumn="0" w:lastColumn="0" w:noHBand="0" w:noVBand="0" w:val="0020"/>
-        <w:jc w:val="start"/>
       </w:tblPr>
       <w:tblGrid>
         <w:gridCol w:w="856"/>
@@ -5930,7 +5919,7 @@
       </w:tblGrid>
       <w:tr>
         <w:trPr>
-          <w:tblHeader w:val="true"/>
+          <w:tblHeader w:val="on"/>
         </w:trPr>
         <w:tc>
           <w:tcPr/>
@@ -5941,8 +5930,8 @@
             </w:pPr>
             <w:r>
               <w:rPr>
+                <w:b/>
                 <w:bCs/>
-                <w:b/>
               </w:rPr>
               <w:t xml:space="preserve">Assumption</w:t>
             </w:r>
@@ -5957,8 +5946,8 @@
             </w:pPr>
             <w:r>
               <w:rPr>
+                <w:b/>
                 <w:bCs/>
-                <w:b/>
               </w:rPr>
               <w:t xml:space="preserve">Description</w:t>
             </w:r>
@@ -5973,8 +5962,8 @@
             </w:pPr>
             <w:r>
               <w:rPr>
+                <w:b/>
                 <w:bCs/>
-                <w:b/>
               </w:rPr>
               <w:t xml:space="preserve">Example of Violation</w:t>
             </w:r>
@@ -5997,8 +5986,8 @@
             </w:r>
             <w:r>
               <w:rPr>
+                <w:b/>
                 <w:bCs/>
-                <w:b/>
               </w:rPr>
               <w:t xml:space="preserve">Validity</w:t>
             </w:r>
@@ -6045,8 +6034,8 @@
             </w:r>
             <w:r>
               <w:rPr>
+                <w:b/>
                 <w:bCs/>
-                <w:b/>
               </w:rPr>
               <w:t xml:space="preserve">Representativeness</w:t>
             </w:r>
@@ -6093,8 +6082,8 @@
             </w:r>
             <w:r>
               <w:rPr>
+                <w:b/>
                 <w:bCs/>
-                <w:b/>
               </w:rPr>
               <w:t xml:space="preserve">Additivity</w:t>
             </w:r>
@@ -6141,8 +6130,8 @@
             </w:r>
             <w:r>
               <w:rPr>
+                <w:b/>
                 <w:bCs/>
-                <w:b/>
               </w:rPr>
               <w:t xml:space="preserve">Linearity</w:t>
             </w:r>
@@ -6189,8 +6178,8 @@
             </w:r>
             <w:r>
               <w:rPr>
+                <w:b/>
                 <w:bCs/>
-                <w:b/>
               </w:rPr>
               <w:t xml:space="preserve">Independence of Errors</w:t>
             </w:r>
@@ -6237,8 +6226,8 @@
             </w:r>
             <w:r>
               <w:rPr>
+                <w:b/>
                 <w:bCs/>
-                <w:b/>
               </w:rPr>
               <w:t xml:space="preserve">Equal Variance of Errors</w:t>
             </w:r>
@@ -6297,8 +6286,8 @@
             </w:r>
             <w:r>
               <w:rPr>
+                <w:b/>
                 <w:bCs/>
-                <w:b/>
               </w:rPr>
               <w:t xml:space="preserve">Normality of Errors</w:t>
             </w:r>
@@ -6364,7 +6353,7 @@
 </file>
 
 <file path=word/numbering.xml><?xml version="1.0" encoding="utf-8"?>
-<w:numbering xmlns:aink="http://schemas.microsoft.com/office/drawing/2016/ink" xmlns:am3d="http://schemas.microsoft.com/office/drawing/2017/model3d" xmlns:cx="http://schemas.microsoft.com/office/drawing/2014/chartex" xmlns:cx1="http://schemas.microsoft.com/office/drawing/2015/9/8/chartex" xmlns:cx2="http://schemas.microsoft.com/office/drawing/2015/10/21/chartex" xmlns:cx3="http://schemas.microsoft.com/office/drawing/2016/5/9/chartex" xmlns:cx4="http://schemas.microsoft.com/office/drawing/2016/5/10/chartex" xmlns:cx5="http://schemas.microsoft.com/office/drawing/2016/5/11/chartex" xmlns:cx6="http://schemas.microsoft.com/office/drawing/2016/5/12/chartex" xmlns:cx7="http://schemas.microsoft.com/office/drawing/2016/5/13/chartex" xmlns:cx8="http://schemas.microsoft.com/office/drawing/2016/5/14/chartex" xmlns:m="http://schemas.openxmlformats.org/officeDocument/2006/math" xmlns:mc="http://schemas.openxmlformats.org/markup-compatibility/2006" xmlns:o="urn:schemas-microsoft-com:office:office" xmlns:oel="http://schemas.microsoft.com/office/2019/extlst" xmlns:r="http://schemas.openxmlformats.org/officeDocument/2006/relationships" xmlns:v="urn:schemas-microsoft-com:vml" xmlns:w="http://schemas.openxmlformats.org/wordprocessingml/2006/main" xmlns:w10="urn:schemas-microsoft-com:office:word" xmlns:w14="http://schemas.microsoft.com/office/word/2010/wordml" xmlns:w15="http://schemas.microsoft.com/office/word/2012/wordml" xmlns:w16="http://schemas.microsoft.com/office/word/2018/wordml" xmlns:w16cex="http://schemas.microsoft.com/office/word/2018/wordml/cex" xmlns:w16cid="http://schemas.microsoft.com/office/word/2016/wordml/cid" xmlns:w16du="http://schemas.microsoft.com/office/word/2023/wordml/word16du" xmlns:w16sdtdh="http://schemas.microsoft.com/office/word/2020/wordml/sdtdatahash" xmlns:w16se="http://schemas.microsoft.com/office/word/2015/wordml/symex" xmlns:wne="http://schemas.microsoft.com/office/word/2006/wordml" xmlns:wp="http://schemas.openxmlformats.org/drawingml/2006/wordprocessingDrawing" xmlns:wp14="http://schemas.microsoft.com/office/word/2010/wordprocessingDrawing" xmlns:wpc="http://schemas.microsoft.com/office/word/2010/wordprocessingCanvas" xmlns:wpg="http://schemas.microsoft.com/office/word/2010/wordprocessingGroup" xmlns:wpi="http://schemas.microsoft.com/office/word/2010/wordprocessingInk" xmlns:wps="http://schemas.microsoft.com/office/word/2010/wordprocessingShape" mc:Ignorable="w14 w15 w16se w16cid w16 w16cex w16sdtdh w16du wp14">
+<w:numbering xmlns:aink="http://schemas.microsoft.com/office/drawing/2016/ink" xmlns:am3d="http://schemas.microsoft.com/office/drawing/2017/model3d" xmlns:cx="http://schemas.microsoft.com/office/drawing/2014/chartex" xmlns:cx1="http://schemas.microsoft.com/office/drawing/2015/9/8/chartex" xmlns:cx2="http://schemas.microsoft.com/office/drawing/2015/10/21/chartex" xmlns:cx3="http://schemas.microsoft.com/office/drawing/2016/5/9/chartex" xmlns:cx4="http://schemas.microsoft.com/office/drawing/2016/5/10/chartex" xmlns:cx5="http://schemas.microsoft.com/office/drawing/2016/5/11/chartex" xmlns:cx6="http://schemas.microsoft.com/office/drawing/2016/5/12/chartex" xmlns:cx7="http://schemas.microsoft.com/office/drawing/2016/5/13/chartex" xmlns:cx8="http://schemas.microsoft.com/office/drawing/2016/5/14/chartex" xmlns:m="http://schemas.openxmlformats.org/officeDocument/2006/math" xmlns:mc="http://schemas.openxmlformats.org/markup-compatibility/2006" xmlns:o="urn:schemas-microsoft-com:office:office" xmlns:oel="http://schemas.microsoft.com/office/2019/extlst" xmlns:r="http://schemas.openxmlformats.org/officeDocument/2006/relationships" xmlns:v="urn:schemas-microsoft-com:vml" xmlns:w="http://schemas.openxmlformats.org/wordprocessingml/2006/main" xmlns:w10="urn:schemas-microsoft-com:office:word" xmlns:w14="http://schemas.microsoft.com/office/word/2010/wordml" xmlns:w15="http://schemas.microsoft.com/office/word/2012/wordml" xmlns:w16="http://schemas.microsoft.com/office/word/2018/wordml" xmlns:w16cex="http://schemas.microsoft.com/office/word/2018/wordml/cex" xmlns:w16cid="http://schemas.microsoft.com/office/word/2016/wordml/cid" xmlns:w16du="http://schemas.microsoft.com/office/word/2023/wordml/word16du" xmlns:w16sdtdh="http://schemas.microsoft.com/office/word/2020/wordml/sdtdatahash" xmlns:w16sdtfl="http://schemas.microsoft.com/office/word/2024/wordml/sdtformatlock" xmlns:w16se="http://schemas.microsoft.com/office/word/2015/wordml/symex" xmlns:wne="http://schemas.microsoft.com/office/word/2006/wordml" xmlns:wp="http://schemas.openxmlformats.org/drawingml/2006/wordprocessingDrawing" xmlns:wp14="http://schemas.microsoft.com/office/word/2010/wordprocessingDrawing" xmlns:wpc="http://schemas.microsoft.com/office/word/2010/wordprocessingCanvas" xmlns:wpg="http://schemas.microsoft.com/office/word/2010/wordprocessingGroup" xmlns:wpi="http://schemas.microsoft.com/office/word/2010/wordprocessingInk" xmlns:wps="http://schemas.microsoft.com/office/word/2010/wordprocessingShape" mc:Ignorable="w14 w15 w16se w16cid w16 w16cex w16sdtdh w16sdtfl w16du wp14">
   <w:abstractNum w15:restartNumberingAfterBreak="0" w:abstractNumId="0">
     <w:nsid w:val="0000A990"/>
     <w:multiLevelType w:val="multilevel"/>
@@ -6606,14 +6595,14 @@
     </w:lvl>
   </w:abstractNum>
   <w:abstractNum w:abstractNumId="990">
-    <w:nsid w:val="A990"/>
+    <w:nsid w:val="0000A990"/>
     <w:multiLevelType w:val="multilevel"/>
     <w:lvl w:ilvl="0">
       <w:numFmt w:val="bullet"/>
       <w:lvlText w:val=" "/>
       <w:lvlJc w:val="left"/>
       <w:pPr>
-        <w:ind w:left="720" w:hanging="480"/>
+        <w:ind w:left="720" w:hanging="360"/>
       </w:pPr>
     </w:lvl>
     <w:lvl w:ilvl="1">
@@ -6621,7 +6610,7 @@
       <w:lvlText w:val=" "/>
       <w:lvlJc w:val="left"/>
       <w:pPr>
-        <w:ind w:left="1440" w:hanging="480"/>
+        <w:ind w:left="1440" w:hanging="360"/>
       </w:pPr>
     </w:lvl>
     <w:lvl w:ilvl="2">
@@ -6629,7 +6618,7 @@
       <w:lvlText w:val=" "/>
       <w:lvlJc w:val="left"/>
       <w:pPr>
-        <w:ind w:left="2160" w:hanging="480"/>
+        <w:ind w:left="2160" w:hanging="360"/>
       </w:pPr>
     </w:lvl>
     <w:lvl w:ilvl="3">
@@ -6637,7 +6626,7 @@
       <w:lvlText w:val=" "/>
       <w:lvlJc w:val="left"/>
       <w:pPr>
-        <w:ind w:left="2880" w:hanging="480"/>
+        <w:ind w:left="2880" w:hanging="360"/>
       </w:pPr>
     </w:lvl>
     <w:lvl w:ilvl="4">
@@ -6645,7 +6634,7 @@
       <w:lvlText w:val=" "/>
       <w:lvlJc w:val="left"/>
       <w:pPr>
-        <w:ind w:left="3600" w:hanging="480"/>
+        <w:ind w:left="3600" w:hanging="360"/>
       </w:pPr>
     </w:lvl>
     <w:lvl w:ilvl="5">
@@ -6653,7 +6642,7 @@
       <w:lvlText w:val=" "/>
       <w:lvlJc w:val="left"/>
       <w:pPr>
-        <w:ind w:left="4320" w:hanging="480"/>
+        <w:ind w:left="4320" w:hanging="360"/>
       </w:pPr>
     </w:lvl>
     <w:lvl w:ilvl="6">
@@ -6661,7 +6650,7 @@
       <w:lvlText w:val=" "/>
       <w:lvlJc w:val="left"/>
       <w:pPr>
-        <w:ind w:left="5040" w:hanging="480"/>
+        <w:ind w:left="5040" w:hanging="360"/>
       </w:pPr>
     </w:lvl>
     <w:lvl w:ilvl="7">
@@ -6669,7 +6658,7 @@
       <w:lvlText w:val=" "/>
       <w:lvlJc w:val="left"/>
       <w:pPr>
-        <w:ind w:left="5760" w:hanging="480"/>
+        <w:ind w:left="5760" w:hanging="360"/>
       </w:pPr>
     </w:lvl>
     <w:lvl w:ilvl="8">
@@ -6677,12 +6666,12 @@
       <w:lvlText w:val=" "/>
       <w:lvlJc w:val="left"/>
       <w:pPr>
-        <w:ind w:left="6480" w:hanging="480"/>
+        <w:ind w:left="6480" w:hanging="360"/>
       </w:pPr>
     </w:lvl>
   </w:abstractNum>
   <w:abstractNum w:abstractNumId="99411">
-    <w:nsid w:val="A99411"/>
+    <w:nsid w:val="00A99411"/>
     <w:multiLevelType w:val="multilevel"/>
     <w:lvl w:ilvl="0">
       <w:start w:val="1"/>
@@ -6690,7 +6679,7 @@
       <w:lvlText w:val="%1."/>
       <w:lvlJc w:val="left"/>
       <w:pPr>
-        <w:ind w:left="720" w:hanging="480"/>
+        <w:ind w:left="720" w:hanging="360"/>
       </w:pPr>
     </w:lvl>
     <w:lvl w:ilvl="1">
@@ -6699,7 +6688,7 @@
       <w:lvlText w:val="%2."/>
       <w:lvlJc w:val="left"/>
       <w:pPr>
-        <w:ind w:left="1440" w:hanging="480"/>
+        <w:ind w:left="1440" w:hanging="360"/>
       </w:pPr>
     </w:lvl>
     <w:lvl w:ilvl="2">
@@ -6708,7 +6697,7 @@
       <w:lvlText w:val="%3."/>
       <w:lvlJc w:val="left"/>
       <w:pPr>
-        <w:ind w:left="2160" w:hanging="480"/>
+        <w:ind w:left="2160" w:hanging="360"/>
       </w:pPr>
     </w:lvl>
     <w:lvl w:ilvl="3">
@@ -6717,7 +6706,7 @@
       <w:lvlText w:val="%4."/>
       <w:lvlJc w:val="left"/>
       <w:pPr>
-        <w:ind w:left="2880" w:hanging="480"/>
+        <w:ind w:left="2880" w:hanging="360"/>
       </w:pPr>
     </w:lvl>
     <w:lvl w:ilvl="4">
@@ -6726,7 +6715,7 @@
       <w:lvlText w:val="%5."/>
       <w:lvlJc w:val="left"/>
       <w:pPr>
-        <w:ind w:left="3600" w:hanging="480"/>
+        <w:ind w:left="3600" w:hanging="360"/>
       </w:pPr>
     </w:lvl>
     <w:lvl w:ilvl="5">
@@ -6735,7 +6724,7 @@
       <w:lvlText w:val="%6."/>
       <w:lvlJc w:val="left"/>
       <w:pPr>
-        <w:ind w:left="4320" w:hanging="480"/>
+        <w:ind w:left="4320" w:hanging="360"/>
       </w:pPr>
     </w:lvl>
     <w:lvl w:ilvl="6">
@@ -6744,7 +6733,7 @@
       <w:lvlText w:val="%7."/>
       <w:lvlJc w:val="left"/>
       <w:pPr>
-        <w:ind w:left="5040" w:hanging="480"/>
+        <w:ind w:left="5040" w:hanging="360"/>
       </w:pPr>
     </w:lvl>
     <w:lvl w:ilvl="7">
@@ -6753,7 +6742,7 @@
       <w:lvlText w:val="%8."/>
       <w:lvlJc w:val="left"/>
       <w:pPr>
-        <w:ind w:left="5760" w:hanging="480"/>
+        <w:ind w:left="5760" w:hanging="360"/>
       </w:pPr>
     </w:lvl>
     <w:lvl w:ilvl="8">
@@ -6762,88 +6751,115 @@
       <w:lvlText w:val="%9."/>
       <w:lvlJc w:val="left"/>
       <w:pPr>
-        <w:ind w:left="6480" w:hanging="480"/>
+        <w:ind w:left="6480" w:hanging="360"/>
       </w:pPr>
     </w:lvl>
   </w:abstractNum>
   <w:abstractNum w:abstractNumId="991">
-    <w:nsid w:val="A991"/>
+    <w:nsid w:val="0000A991"/>
     <w:multiLevelType w:val="multilevel"/>
     <w:lvl w:ilvl="0">
       <w:numFmt w:val="bullet"/>
-      <w:lvlText w:val="•"/>
+      <w:lvlText w:val=""/>
       <w:lvlJc w:val="left"/>
       <w:pPr>
-        <w:ind w:left="720" w:hanging="480"/>
-      </w:pPr>
+        <w:ind w:left="720" w:hanging="360"/>
+      </w:pPr>
+      <w:rPr>
+        <w:rFonts w:ascii="Symbol" w:hAnsi="Symbol" w:cs="Symbol" w:hint="default"/>
+      </w:rPr>
     </w:lvl>
     <w:lvl w:ilvl="1">
       <w:numFmt w:val="bullet"/>
-      <w:lvlText w:val="–"/>
+      <w:lvlText w:val="o"/>
       <w:lvlJc w:val="left"/>
       <w:pPr>
-        <w:ind w:left="1440" w:hanging="480"/>
-      </w:pPr>
+        <w:ind w:left="1440" w:hanging="360"/>
+      </w:pPr>
+      <w:rPr>
+        <w:rFonts w:ascii="Courier New" w:hAnsi="Courier New" w:cs="Courier New" w:hint="default"/>
+      </w:rPr>
     </w:lvl>
     <w:lvl w:ilvl="2">
       <w:numFmt w:val="bullet"/>
-      <w:lvlText w:val="•"/>
+      <w:lvlText w:val=""/>
       <w:lvlJc w:val="left"/>
       <w:pPr>
-        <w:ind w:left="2160" w:hanging="480"/>
-      </w:pPr>
+        <w:ind w:left="2160" w:hanging="360"/>
+      </w:pPr>
+      <w:rPr>
+        <w:rFonts w:ascii="Wingdings" w:hAnsi="Wingdings" w:cs="Wingdings" w:hint="default"/>
+      </w:rPr>
     </w:lvl>
     <w:lvl w:ilvl="3">
       <w:numFmt w:val="bullet"/>
-      <w:lvlText w:val="–"/>
+      <w:lvlText w:val=""/>
       <w:lvlJc w:val="left"/>
       <w:pPr>
-        <w:ind w:left="2880" w:hanging="480"/>
-      </w:pPr>
+        <w:ind w:left="2880" w:hanging="360"/>
+      </w:pPr>
+      <w:rPr>
+        <w:rFonts w:ascii="Symbol" w:hAnsi="Symbol" w:cs="Symbol" w:hint="default"/>
+      </w:rPr>
     </w:lvl>
     <w:lvl w:ilvl="4">
       <w:numFmt w:val="bullet"/>
-      <w:lvlText w:val="•"/>
+      <w:lvlText w:val="o"/>
       <w:lvlJc w:val="left"/>
       <w:pPr>
-        <w:ind w:left="3600" w:hanging="480"/>
-      </w:pPr>
+        <w:ind w:left="3600" w:hanging="360"/>
+      </w:pPr>
+      <w:rPr>
+        <w:rFonts w:ascii="Courier New" w:hAnsi="Courier New" w:cs="Courier New" w:hint="default"/>
+      </w:rPr>
     </w:lvl>
     <w:lvl w:ilvl="5">
       <w:numFmt w:val="bullet"/>
-      <w:lvlText w:val="–"/>
+      <w:lvlText w:val=""/>
       <w:lvlJc w:val="left"/>
       <w:pPr>
-        <w:ind w:left="4320" w:hanging="480"/>
-      </w:pPr>
+        <w:ind w:left="4320" w:hanging="360"/>
+      </w:pPr>
+      <w:rPr>
+        <w:rFonts w:ascii="Wingdings" w:hAnsi="Wingdings" w:cs="Wingdings" w:hint="default"/>
+      </w:rPr>
     </w:lvl>
     <w:lvl w:ilvl="6">
       <w:numFmt w:val="bullet"/>
-      <w:lvlText w:val="•"/>
+      <w:lvlText w:val=""/>
       <w:lvlJc w:val="left"/>
       <w:pPr>
-        <w:ind w:left="5040" w:hanging="480"/>
-      </w:pPr>
+        <w:ind w:left="5040" w:hanging="360"/>
+      </w:pPr>
+      <w:rPr>
+        <w:rFonts w:ascii="Symbol" w:hAnsi="Symbol" w:cs="Symbol" w:hint="default"/>
+      </w:rPr>
     </w:lvl>
     <w:lvl w:ilvl="7">
       <w:numFmt w:val="bullet"/>
-      <w:lvlText w:val="–"/>
+      <w:lvlText w:val="o"/>
       <w:lvlJc w:val="left"/>
       <w:pPr>
-        <w:ind w:left="5760" w:hanging="480"/>
-      </w:pPr>
+        <w:ind w:left="5760" w:hanging="360"/>
+      </w:pPr>
+      <w:rPr>
+        <w:rFonts w:ascii="Courier New" w:hAnsi="Courier New" w:cs="Courier New" w:hint="default"/>
+      </w:rPr>
     </w:lvl>
     <w:lvl w:ilvl="8">
       <w:numFmt w:val="bullet"/>
-      <w:lvlText w:val="•"/>
+      <w:lvlText w:val=""/>
       <w:lvlJc w:val="left"/>
       <w:pPr>
-        <w:ind w:left="6480" w:hanging="480"/>
-      </w:pPr>
+        <w:ind w:left="6480" w:hanging="360"/>
+      </w:pPr>
+      <w:rPr>
+        <w:rFonts w:ascii="Wingdings" w:hAnsi="Wingdings" w:cs="Wingdings" w:hint="default"/>
+      </w:rPr>
     </w:lvl>
   </w:abstractNum>
   <w:abstractNum w:abstractNumId="99412">
-    <w:nsid w:val="A99412"/>
+    <w:nsid w:val="00A99412"/>
     <w:multiLevelType w:val="multilevel"/>
     <w:lvl w:ilvl="0">
       <w:start w:val="2"/>
@@ -6851,7 +6867,7 @@
       <w:lvlText w:val="%1."/>
       <w:lvlJc w:val="left"/>
       <w:pPr>
-        <w:ind w:left="720" w:hanging="480"/>
+        <w:ind w:left="720" w:hanging="360"/>
       </w:pPr>
     </w:lvl>
     <w:lvl w:ilvl="1">
@@ -6860,7 +6876,7 @@
       <w:lvlText w:val="%2."/>
       <w:lvlJc w:val="left"/>
       <w:pPr>
-        <w:ind w:left="1440" w:hanging="480"/>
+        <w:ind w:left="1440" w:hanging="360"/>
       </w:pPr>
     </w:lvl>
     <w:lvl w:ilvl="2">
@@ -6869,7 +6885,7 @@
       <w:lvlText w:val="%3."/>
       <w:lvlJc w:val="left"/>
       <w:pPr>
-        <w:ind w:left="2160" w:hanging="480"/>
+        <w:ind w:left="2160" w:hanging="360"/>
       </w:pPr>
     </w:lvl>
     <w:lvl w:ilvl="3">
@@ -6878,7 +6894,7 @@
       <w:lvlText w:val="%4."/>
       <w:lvlJc w:val="left"/>
       <w:pPr>
-        <w:ind w:left="2880" w:hanging="480"/>
+        <w:ind w:left="2880" w:hanging="360"/>
       </w:pPr>
     </w:lvl>
     <w:lvl w:ilvl="4">
@@ -6887,7 +6903,7 @@
       <w:lvlText w:val="%5."/>
       <w:lvlJc w:val="left"/>
       <w:pPr>
-        <w:ind w:left="3600" w:hanging="480"/>
+        <w:ind w:left="3600" w:hanging="360"/>
       </w:pPr>
     </w:lvl>
     <w:lvl w:ilvl="5">
@@ -6896,7 +6912,7 @@
       <w:lvlText w:val="%6."/>
       <w:lvlJc w:val="left"/>
       <w:pPr>
-        <w:ind w:left="4320" w:hanging="480"/>
+        <w:ind w:left="4320" w:hanging="360"/>
       </w:pPr>
     </w:lvl>
     <w:lvl w:ilvl="6">
@@ -6905,7 +6921,7 @@
       <w:lvlText w:val="%7."/>
       <w:lvlJc w:val="left"/>
       <w:pPr>
-        <w:ind w:left="5040" w:hanging="480"/>
+        <w:ind w:left="5040" w:hanging="360"/>
       </w:pPr>
     </w:lvl>
     <w:lvl w:ilvl="7">
@@ -6914,7 +6930,7 @@
       <w:lvlText w:val="%8."/>
       <w:lvlJc w:val="left"/>
       <w:pPr>
-        <w:ind w:left="5760" w:hanging="480"/>
+        <w:ind w:left="5760" w:hanging="360"/>
       </w:pPr>
     </w:lvl>
     <w:lvl w:ilvl="8">
@@ -6923,7 +6939,7 @@
       <w:lvlText w:val="%9."/>
       <w:lvlJc w:val="left"/>
       <w:pPr>
-        <w:ind w:left="6480" w:hanging="480"/>
+        <w:ind w:left="6480" w:hanging="360"/>
       </w:pPr>
     </w:lvl>
   </w:abstractNum>
@@ -7138,7 +7154,7 @@
 </file>
 
 <file path=word/styles.xml><?xml version="1.0" encoding="utf-8"?>
-<w:styles xmlns:mc="http://schemas.openxmlformats.org/markup-compatibility/2006" xmlns:r="http://schemas.openxmlformats.org/officeDocument/2006/relationships" xmlns:w="http://schemas.openxmlformats.org/wordprocessingml/2006/main" xmlns:w14="http://schemas.microsoft.com/office/word/2010/wordml" xmlns:w15="http://schemas.microsoft.com/office/word/2012/wordml" xmlns:w16="http://schemas.microsoft.com/office/word/2018/wordml" xmlns:w16cex="http://schemas.microsoft.com/office/word/2018/wordml/cex" xmlns:w16cid="http://schemas.microsoft.com/office/word/2016/wordml/cid" xmlns:w16du="http://schemas.microsoft.com/office/word/2023/wordml/word16du" xmlns:w16sdtdh="http://schemas.microsoft.com/office/word/2020/wordml/sdtdatahash" xmlns:w16se="http://schemas.microsoft.com/office/word/2015/wordml/symex" mc:Ignorable="w14 w15 w16se w16cid w16 w16cex w16sdtdh w16du">
+<w:styles xmlns:mc="http://schemas.openxmlformats.org/markup-compatibility/2006" xmlns:r="http://schemas.openxmlformats.org/officeDocument/2006/relationships" xmlns:w="http://schemas.openxmlformats.org/wordprocessingml/2006/main" xmlns:w14="http://schemas.microsoft.com/office/word/2010/wordml" xmlns:w15="http://schemas.microsoft.com/office/word/2012/wordml" xmlns:w16="http://schemas.microsoft.com/office/word/2018/wordml" xmlns:w16cex="http://schemas.microsoft.com/office/word/2018/wordml/cex" xmlns:w16cid="http://schemas.microsoft.com/office/word/2016/wordml/cid" xmlns:w16du="http://schemas.microsoft.com/office/word/2023/wordml/word16du" xmlns:w16sdtdh="http://schemas.microsoft.com/office/word/2020/wordml/sdtdatahash" xmlns:w16sdtfl="http://schemas.microsoft.com/office/word/2024/wordml/sdtformatlock" xmlns:w16se="http://schemas.microsoft.com/office/word/2015/wordml/symex" mc:Ignorable="w14 w15 w16se w16cid w16 w16cex w16sdtdh w16sdtfl w16du">
   <w:docDefaults>
     <w:rPrDefault>
       <w:rPr>
@@ -7832,9 +7848,10 @@
     <w:name w:val="Verbatim Char"/>
     <w:basedOn w:val="CaptionChar"/>
     <w:link w:val="SourceCode"/>
-    <w:rsid w:val="00F34E30"/>
+    <w:rsid w:val="00796E50"/>
     <w:rPr>
       <w:rFonts w:ascii="Consolas" w:hAnsi="Consolas"/>
+      <w:sz w:val="22"/>
       <w:shd w:color="auto" w:fill="F8F8F8" w:val="clear"/>
     </w:rPr>
   </w:style>
@@ -7879,10 +7896,11 @@
     <w:name w:val="Source Code"/>
     <w:basedOn w:val="Normal"/>
     <w:link w:val="VerbatimChar"/>
-    <w:rsid w:val="00F34E30"/>
+    <w:rsid w:val="00796E50"/>
     <w:pPr>
       <w:shd w:color="auto" w:fill="F8F8F8" w:val="clear"/>
       <w:wordWrap w:val="0"/>
+      <w:textboxTightWrap w:val="allLines"/>
     </w:pPr>
     <w:rPr>
       <w:rFonts w:ascii="Consolas" w:hAnsi="Consolas"/>
@@ -7895,6 +7913,7 @@
       <w:rFonts w:ascii="Consolas" w:hAnsi="Consolas"/>
       <w:b/>
       <w:color w:val="204A87"/>
+      <w:sz w:val="22"/>
       <w:shd w:color="auto" w:fill="F8F8F8" w:val="clear"/>
     </w:rPr>
   </w:style>
@@ -7904,6 +7923,7 @@
     <w:rPr>
       <w:rFonts w:ascii="Consolas" w:hAnsi="Consolas"/>
       <w:color w:val="204A87"/>
+      <w:sz w:val="22"/>
       <w:shd w:color="auto" w:fill="F8F8F8" w:val="clear"/>
     </w:rPr>
   </w:style>
@@ -7913,6 +7933,7 @@
     <w:rPr>
       <w:rFonts w:ascii="Consolas" w:hAnsi="Consolas"/>
       <w:color w:val="0000CF"/>
+      <w:sz w:val="22"/>
       <w:shd w:color="auto" w:fill="F8F8F8" w:val="clear"/>
     </w:rPr>
   </w:style>
@@ -7922,6 +7943,7 @@
     <w:rPr>
       <w:rFonts w:ascii="Consolas" w:hAnsi="Consolas"/>
       <w:color w:val="0000CF"/>
+      <w:sz w:val="22"/>
       <w:shd w:color="auto" w:fill="F8F8F8" w:val="clear"/>
     </w:rPr>
   </w:style>
@@ -7931,6 +7953,7 @@
     <w:rPr>
       <w:rFonts w:ascii="Consolas" w:hAnsi="Consolas"/>
       <w:color w:val="0000CF"/>
+      <w:sz w:val="22"/>
       <w:shd w:color="auto" w:fill="F8F8F8" w:val="clear"/>
     </w:rPr>
   </w:style>
@@ -7941,6 +7964,7 @@
     <w:rPr>
       <w:rFonts w:ascii="Consolas" w:hAnsi="Consolas"/>
       <w:color w:themeColor="accent2" w:themeShade="BF" w:val="943634"/>
+      <w:sz w:val="22"/>
       <w:shd w:color="auto" w:fill="F8F8F8" w:val="clear"/>
     </w:rPr>
   </w:style>
@@ -7950,6 +7974,7 @@
     <w:rPr>
       <w:rFonts w:ascii="Consolas" w:hAnsi="Consolas"/>
       <w:color w:val="4E9A06"/>
+      <w:sz w:val="22"/>
       <w:shd w:color="auto" w:fill="F8F8F8" w:val="clear"/>
     </w:rPr>
   </w:style>
@@ -7960,6 +7985,7 @@
       <w:rFonts w:ascii="Consolas" w:hAnsi="Consolas"/>
       <w:b/>
       <w:color w:val="CE5C00"/>
+      <w:sz w:val="22"/>
       <w:shd w:color="auto" w:fill="F8F8F8" w:val="clear"/>
     </w:rPr>
   </w:style>
@@ -7969,6 +7995,7 @@
     <w:rPr>
       <w:rFonts w:ascii="Consolas" w:hAnsi="Consolas"/>
       <w:color w:val="4E9A06"/>
+      <w:sz w:val="22"/>
       <w:shd w:color="auto" w:fill="F8F8F8" w:val="clear"/>
     </w:rPr>
   </w:style>
@@ -7978,6 +8005,7 @@
     <w:rPr>
       <w:rFonts w:ascii="Consolas" w:hAnsi="Consolas"/>
       <w:color w:val="4E9A06"/>
+      <w:sz w:val="22"/>
       <w:shd w:color="auto" w:fill="F8F8F8" w:val="clear"/>
     </w:rPr>
   </w:style>
@@ -7987,6 +8015,7 @@
     <w:rPr>
       <w:rFonts w:ascii="Consolas" w:hAnsi="Consolas"/>
       <w:color w:val="4E9A06"/>
+      <w:sz w:val="22"/>
       <w:shd w:color="auto" w:fill="F8F8F8" w:val="clear"/>
     </w:rPr>
   </w:style>
@@ -7995,6 +8024,7 @@
     <w:basedOn w:val="VerbatimChar"/>
     <w:rPr>
       <w:rFonts w:ascii="Consolas" w:hAnsi="Consolas"/>
+      <w:sz w:val="22"/>
       <w:shd w:color="auto" w:fill="F8F8F8" w:val="clear"/>
     </w:rPr>
   </w:style>
@@ -8006,6 +8036,7 @@
       <w:rFonts w:ascii="Consolas" w:hAnsi="Consolas"/>
       <w:i/>
       <w:color w:themeColor="accent4" w:themeTint="99" w:val="B2A1C7"/>
+      <w:sz w:val="22"/>
       <w:shd w:color="auto" w:fill="F8F8F8" w:val="clear"/>
     </w:rPr>
   </w:style>
@@ -8017,6 +8048,7 @@
       <w:b/>
       <w:i/>
       <w:color w:val="8F5902"/>
+      <w:sz w:val="22"/>
       <w:shd w:color="auto" w:fill="F8F8F8" w:val="clear"/>
     </w:rPr>
   </w:style>
@@ -8028,6 +8060,7 @@
       <w:b/>
       <w:i/>
       <w:color w:val="8F5902"/>
+      <w:sz w:val="22"/>
       <w:shd w:color="auto" w:fill="F8F8F8" w:val="clear"/>
     </w:rPr>
   </w:style>
@@ -8039,6 +8072,7 @@
       <w:b/>
       <w:i/>
       <w:color w:val="8F5902"/>
+      <w:sz w:val="22"/>
       <w:shd w:color="auto" w:fill="F8F8F8" w:val="clear"/>
     </w:rPr>
   </w:style>
@@ -8048,6 +8082,7 @@
     <w:rPr>
       <w:rFonts w:ascii="Consolas" w:hAnsi="Consolas"/>
       <w:color w:val="8F5902"/>
+      <w:sz w:val="22"/>
       <w:shd w:color="auto" w:fill="F8F8F8" w:val="clear"/>
     </w:rPr>
   </w:style>
@@ -8059,6 +8094,7 @@
       <w:rFonts w:ascii="Consolas" w:hAnsi="Consolas"/>
       <w:b/>
       <w:color w:themeColor="accent6" w:val="F79646"/>
+      <w:sz w:val="22"/>
       <w:shd w:color="auto" w:fill="F8F8F8" w:val="clear"/>
     </w:rPr>
   </w:style>
@@ -8068,6 +8104,7 @@
     <w:rPr>
       <w:rFonts w:ascii="Consolas" w:hAnsi="Consolas"/>
       <w:color w:val="000000"/>
+      <w:sz w:val="22"/>
       <w:shd w:color="auto" w:fill="F8F8F8" w:val="clear"/>
     </w:rPr>
   </w:style>
@@ -8078,6 +8115,7 @@
       <w:rFonts w:ascii="Consolas" w:hAnsi="Consolas"/>
       <w:b/>
       <w:color w:val="204A87"/>
+      <w:sz w:val="22"/>
       <w:shd w:color="auto" w:fill="F8F8F8" w:val="clear"/>
     </w:rPr>
   </w:style>
@@ -8088,6 +8126,7 @@
       <w:rFonts w:ascii="Consolas" w:hAnsi="Consolas"/>
       <w:b/>
       <w:color w:val="CE5C00"/>
+      <w:sz w:val="22"/>
       <w:shd w:color="auto" w:fill="F8F8F8" w:val="clear"/>
     </w:rPr>
   </w:style>
@@ -8096,6 +8135,7 @@
     <w:basedOn w:val="VerbatimChar"/>
     <w:rPr>
       <w:rFonts w:ascii="Consolas" w:hAnsi="Consolas"/>
+      <w:sz w:val="22"/>
       <w:shd w:color="auto" w:fill="F8F8F8" w:val="clear"/>
     </w:rPr>
   </w:style>
@@ -8104,6 +8144,7 @@
     <w:basedOn w:val="VerbatimChar"/>
     <w:rPr>
       <w:rFonts w:ascii="Consolas" w:hAnsi="Consolas"/>
+      <w:sz w:val="22"/>
       <w:shd w:color="auto" w:fill="F8F8F8" w:val="clear"/>
     </w:rPr>
   </w:style>
@@ -8114,6 +8155,7 @@
       <w:rFonts w:ascii="Consolas" w:hAnsi="Consolas"/>
       <w:i/>
       <w:color w:val="8F5902"/>
+      <w:sz w:val="22"/>
       <w:shd w:color="auto" w:fill="F8F8F8" w:val="clear"/>
     </w:rPr>
   </w:style>
@@ -8123,6 +8165,7 @@
     <w:rPr>
       <w:rFonts w:ascii="Consolas" w:hAnsi="Consolas"/>
       <w:color w:val="204A87"/>
+      <w:sz w:val="22"/>
       <w:shd w:color="auto" w:fill="F8F8F8" w:val="clear"/>
     </w:rPr>
   </w:style>
@@ -8131,6 +8174,7 @@
     <w:basedOn w:val="VerbatimChar"/>
     <w:rPr>
       <w:rFonts w:ascii="Consolas" w:hAnsi="Consolas"/>
+      <w:sz w:val="22"/>
       <w:shd w:color="auto" w:fill="F8F8F8" w:val="clear"/>
     </w:rPr>
   </w:style>
@@ -8142,6 +8186,7 @@
       <w:b/>
       <w:i/>
       <w:color w:val="8F5902"/>
+      <w:sz w:val="22"/>
       <w:shd w:color="auto" w:fill="F8F8F8" w:val="clear"/>
     </w:rPr>
   </w:style>
@@ -8153,6 +8198,7 @@
       <w:b/>
       <w:i/>
       <w:color w:val="8F5902"/>
+      <w:sz w:val="22"/>
       <w:shd w:color="auto" w:fill="F8F8F8" w:val="clear"/>
     </w:rPr>
   </w:style>
@@ -8162,6 +8208,7 @@
     <w:rPr>
       <w:rFonts w:ascii="Consolas" w:hAnsi="Consolas"/>
       <w:color w:val="EF2929"/>
+      <w:sz w:val="22"/>
       <w:shd w:color="auto" w:fill="F8F8F8" w:val="clear"/>
     </w:rPr>
   </w:style>
@@ -8172,6 +8219,7 @@
       <w:rFonts w:ascii="Consolas" w:hAnsi="Consolas"/>
       <w:b/>
       <w:color w:val="A40000"/>
+      <w:sz w:val="22"/>
       <w:shd w:color="auto" w:fill="F8F8F8" w:val="clear"/>
     </w:rPr>
   </w:style>
@@ -8182,6 +8230,7 @@
     <w:rPr>
       <w:rFonts w:ascii="Consolas" w:hAnsi="Consolas"/>
       <w:color w:themeColor="text1" w:themeTint="F2" w:val="0D0D0D"/>
+      <w:sz w:val="22"/>
       <w:shd w:color="auto" w:fill="F8F8F8" w:val="clear"/>
     </w:rPr>
   </w:style>

</xml_diff>